<commit_message>
23.10: mockup, seconda arma (fucile d'assalto), prototipo tecnico in Godot
Co-Authored-By: Claude Opus 5.5 <noreply@anthropic.com>
Claude-Session: https://claude.ai/code/session_01CZyEVvgqdMDMXsFUDM4KeF
</commit_message>
<xml_diff>
--- a/4_Diari/Diario.docx
+++ b/4_Diari/Diario.docx
@@ -3091,6 +3091,841 @@
           <w:rFonts w:ascii="Arial" w:hAnsi="Arial" w:cs="Arial"/>
         </w:rPr>
         <w:t>.</w:t>
+      </w:r>
+    </w:p>
+    <w:p>
+      <w:pPr>
+        <w:pStyle w:val="Titolo"/>
+        <w:pBdr>
+          <w:bottom w:val="single" w:sz="4" w:space="4" w:color="auto"/>
+        </w:pBdr>
+        <w:rPr>
+          <w:rFonts w:ascii="Arial" w:hAnsi="Arial" w:cs="Arial"/>
+          <w:color w:val="auto"/>
+        </w:rPr>
+      </w:pPr>
+      <w:r>
+        <w:br w:type="page"/>
+      </w:r>
+      <w:r>
+        <w:rPr>
+          <w:rFonts w:ascii="Arial" w:hAnsi="Arial" w:cs="Arial"/>
+          <w:color w:val="auto"/>
+        </w:rPr>
+        <w:lastRenderedPageBreak/>
+        <w:t>Diario di lavoro</w:t>
+      </w:r>
+    </w:p>
+    <w:tbl>
+      <w:tblPr>
+        <w:tblStyle w:val="Grigliatabella"/>
+        <w:tblW w:w="5000" w:type="pct"/>
+        <w:tblLook w:val="04A0" w:firstRow="1" w:lastRow="0" w:firstColumn="1" w:lastColumn="0" w:noHBand="0" w:noVBand="1"/>
+      </w:tblPr>
+      <w:tblGrid>
+        <w:gridCol w:w="2407"/>
+        <w:gridCol w:w="2407"/>
+        <w:gridCol w:w="2407"/>
+        <w:gridCol w:w="2407"/>
+      </w:tblGrid>
+      <w:tr>
+        <w:trPr>
+          <w:trHeight w:val="199"/>
+        </w:trPr>
+        <w:tc>
+          <w:tcPr>
+            <w:tcW w:w="1250" w:type="pct"/>
+            <w:vAlign w:val="center"/>
+          </w:tcPr>
+          <w:p>
+            <w:pPr>
+              <w:rPr>
+                <w:rFonts w:ascii="Arial" w:hAnsi="Arial" w:cs="Arial"/>
+              </w:rPr>
+            </w:pPr>
+            <w:r>
+              <w:rPr>
+                <w:rFonts w:ascii="Arial" w:hAnsi="Arial" w:cs="Arial"/>
+              </w:rPr>
+              <w:t>Luogo</w:t>
+            </w:r>
+          </w:p>
+        </w:tc>
+        <w:tc>
+          <w:tcPr>
+            <w:tcW w:w="3750" w:type="pct"/>
+            <w:gridSpan w:val="3"/>
+            <w:vAlign w:val="center"/>
+          </w:tcPr>
+          <w:p>
+            <w:pPr>
+              <w:rPr>
+                <w:rFonts w:ascii="Arial" w:hAnsi="Arial" w:cs="Arial"/>
+              </w:rPr>
+            </w:pPr>
+            <w:r>
+              <w:rPr>
+                <w:rFonts w:ascii="Arial" w:hAnsi="Arial" w:cs="Arial"/>
+              </w:rPr>
+              <w:t>Canobbio, CPT Trevano</w:t>
+            </w:r>
+          </w:p>
+        </w:tc>
+      </w:tr>
+      <w:tr>
+        <w:trPr>
+          <w:trHeight w:val="196"/>
+        </w:trPr>
+        <w:tc>
+          <w:tcPr>
+            <w:tcW w:w="1250" w:type="pct"/>
+            <w:vAlign w:val="center"/>
+          </w:tcPr>
+          <w:p>
+            <w:pPr>
+              <w:rPr>
+                <w:rFonts w:ascii="Arial" w:hAnsi="Arial" w:cs="Arial"/>
+              </w:rPr>
+            </w:pPr>
+            <w:r>
+              <w:rPr>
+                <w:rFonts w:ascii="Arial" w:hAnsi="Arial" w:cs="Arial"/>
+              </w:rPr>
+              <w:t>Data</w:t>
+            </w:r>
+          </w:p>
+        </w:tc>
+        <w:tc>
+          <w:tcPr>
+            <w:tcW w:w="3750" w:type="pct"/>
+            <w:gridSpan w:val="3"/>
+            <w:vAlign w:val="center"/>
+          </w:tcPr>
+          <w:p>
+            <w:pPr>
+              <w:rPr>
+                <w:rFonts w:ascii="Arial" w:hAnsi="Arial" w:cs="Arial"/>
+              </w:rPr>
+            </w:pPr>
+            <w:r>
+              <w:rPr>
+                <w:rFonts w:ascii="Arial" w:hAnsi="Arial" w:cs="Arial"/>
+              </w:rPr>
+              <w:t>23.10.2026</w:t>
+            </w:r>
+          </w:p>
+        </w:tc>
+      </w:tr>
+      <w:tr>
+        <w:trPr>
+          <w:trHeight w:val="196"/>
+        </w:trPr>
+        <w:tc>
+          <w:tcPr>
+            <w:tcW w:w="1250" w:type="pct"/>
+            <w:vAlign w:val="center"/>
+          </w:tcPr>
+          <w:p>
+            <w:pPr>
+              <w:rPr>
+                <w:rFonts w:ascii="Arial" w:hAnsi="Arial" w:cs="Arial"/>
+              </w:rPr>
+            </w:pPr>
+            <w:r>
+              <w:rPr>
+                <w:rFonts w:ascii="Arial" w:hAnsi="Arial" w:cs="Arial"/>
+              </w:rPr>
+              <w:t>Mattino</w:t>
+            </w:r>
+          </w:p>
+        </w:tc>
+        <w:tc>
+          <w:tcPr>
+            <w:tcW w:w="1250" w:type="pct"/>
+            <w:vAlign w:val="center"/>
+          </w:tcPr>
+          <w:p>
+            <w:pPr>
+              <w:rPr>
+                <w:rFonts w:ascii="Arial" w:hAnsi="Arial" w:cs="Arial"/>
+              </w:rPr>
+            </w:pPr>
+            <w:r>
+              <w:rPr>
+                <w:rFonts w:ascii="Arial" w:hAnsi="Arial" w:cs="Arial"/>
+              </w:rPr>
+              <w:t>8:20 – 11:35</w:t>
+            </w:r>
+          </w:p>
+        </w:tc>
+        <w:tc>
+          <w:tcPr>
+            <w:tcW w:w="1250" w:type="pct"/>
+            <w:vAlign w:val="center"/>
+          </w:tcPr>
+          <w:p>
+            <w:pPr>
+              <w:rPr>
+                <w:rFonts w:ascii="Arial" w:hAnsi="Arial" w:cs="Arial"/>
+              </w:rPr>
+            </w:pPr>
+            <w:r>
+              <w:rPr>
+                <w:rFonts w:ascii="Arial" w:hAnsi="Arial" w:cs="Arial"/>
+              </w:rPr>
+              <w:t>Pomeriggio</w:t>
+            </w:r>
+          </w:p>
+        </w:tc>
+        <w:tc>
+          <w:tcPr>
+            <w:tcW w:w="1250" w:type="pct"/>
+            <w:vAlign w:val="center"/>
+          </w:tcPr>
+          <w:p>
+            <w:pPr>
+              <w:rPr>
+                <w:rFonts w:ascii="Arial" w:hAnsi="Arial" w:cs="Arial"/>
+              </w:rPr>
+            </w:pPr>
+            <w:r>
+              <w:rPr>
+                <w:rFonts w:ascii="Arial" w:hAnsi="Arial" w:cs="Arial"/>
+              </w:rPr>
+              <w:t>12:30 – 15:45</w:t>
+            </w:r>
+          </w:p>
+        </w:tc>
+      </w:tr>
+    </w:tbl>
+    <w:p>
+      <w:pPr>
+        <w:rPr>
+          <w:rFonts w:ascii="Arial" w:hAnsi="Arial" w:cs="Arial"/>
+        </w:rPr>
+      </w:pPr>
+    </w:p>
+    <w:tbl>
+      <w:tblPr>
+        <w:tblStyle w:val="Grigliatabella"/>
+        <w:tblW w:w="0" w:type="auto"/>
+        <w:tblLook w:val="04A0" w:firstRow="1" w:lastRow="0" w:firstColumn="1" w:lastColumn="0" w:noHBand="0" w:noVBand="1"/>
+      </w:tblPr>
+      <w:tblGrid>
+        <w:gridCol w:w="9628"/>
+      </w:tblGrid>
+      <w:tr>
+        <w:tc>
+          <w:tcPr>
+            <w:tcW w:w="9854" w:type="dxa"/>
+            <w:shd w:val="clear" w:color="auto" w:fill="D9D9D9" w:themeFill="background1" w:themeFillShade="D9"/>
+          </w:tcPr>
+          <w:p>
+            <w:pPr>
+              <w:rPr>
+                <w:rFonts w:ascii="Arial" w:hAnsi="Arial" w:cs="Arial"/>
+              </w:rPr>
+            </w:pPr>
+            <w:r>
+              <w:rPr>
+                <w:rFonts w:ascii="Arial" w:hAnsi="Arial" w:cs="Arial"/>
+              </w:rPr>
+              <w:t>Lavori svolti</w:t>
+            </w:r>
+          </w:p>
+        </w:tc>
+      </w:tr>
+      <w:tr>
+        <w:tc>
+          <w:tcPr>
+            <w:tcW w:w="9854" w:type="dxa"/>
+          </w:tcPr>
+          <w:p>
+            <w:pPr>
+              <w:rPr>
+                <w:rFonts w:ascii="Arial" w:hAnsi="Arial" w:cs="Arial"/>
+              </w:rPr>
+            </w:pPr>
+            <w:r>
+              <w:rPr>
+                <w:rFonts w:ascii="Arial" w:hAnsi="Arial" w:cs="Arial"/>
+              </w:rPr>
+              <w:t>Mockup delle interfacce</w:t>
+            </w:r>
+          </w:p>
+          <w:p>
+            <w:pPr>
+              <w:rPr>
+                <w:rFonts w:ascii="Arial" w:hAnsi="Arial" w:cs="Arial"/>
+              </w:rPr>
+            </w:pPr>
+            <w:r>
+              <w:rPr>
+                <w:rFonts w:ascii="Arial" w:hAnsi="Arial" w:cs="Arial"/>
+              </w:rPr>
+              <w:t>Aggiunta del fucile d’assalto e scelta dell’arma</w:t>
+            </w:r>
+          </w:p>
+          <w:p>
+            <w:pPr>
+              <w:rPr>
+                <w:rFonts w:ascii="Arial" w:hAnsi="Arial" w:cs="Arial"/>
+              </w:rPr>
+            </w:pPr>
+            <w:r>
+              <w:rPr>
+                <w:rFonts w:ascii="Arial" w:hAnsi="Arial" w:cs="Arial"/>
+              </w:rPr>
+              <w:t>Aggiornamento documentazione</w:t>
+            </w:r>
+          </w:p>
+          <w:p>
+            <w:pPr>
+              <w:rPr>
+                <w:rFonts w:ascii="Arial" w:hAnsi="Arial" w:cs="Arial"/>
+              </w:rPr>
+            </w:pPr>
+            <w:r>
+              <w:rPr>
+                <w:rFonts w:ascii="Arial" w:hAnsi="Arial" w:cs="Arial"/>
+              </w:rPr>
+              <w:t>Prototipo tecnico in Godot (stanza, movimento, raycast)</w:t>
+            </w:r>
+          </w:p>
+        </w:tc>
+      </w:tr>
+    </w:tbl>
+    <w:p>
+      <w:pPr>
+        <w:rPr>
+          <w:rFonts w:ascii="Arial" w:hAnsi="Arial" w:cs="Arial"/>
+        </w:rPr>
+      </w:pPr>
+    </w:p>
+    <w:tbl>
+      <w:tblPr>
+        <w:tblStyle w:val="Grigliatabella"/>
+        <w:tblW w:w="0" w:type="auto"/>
+        <w:tblLook w:val="04A0" w:firstRow="1" w:lastRow="0" w:firstColumn="1" w:lastColumn="0" w:noHBand="0" w:noVBand="1"/>
+      </w:tblPr>
+      <w:tblGrid>
+        <w:gridCol w:w="9628"/>
+      </w:tblGrid>
+      <w:tr>
+        <w:tc>
+          <w:tcPr>
+            <w:tcW w:w="9854" w:type="dxa"/>
+            <w:shd w:val="clear" w:color="auto" w:fill="D9D9D9" w:themeFill="background1" w:themeFillShade="D9"/>
+          </w:tcPr>
+          <w:p>
+            <w:pPr>
+              <w:rPr>
+                <w:rFonts w:ascii="Arial" w:hAnsi="Arial" w:cs="Arial"/>
+              </w:rPr>
+            </w:pPr>
+            <w:r>
+              <w:rPr>
+                <w:rFonts w:ascii="Arial" w:hAnsi="Arial" w:cs="Arial"/>
+              </w:rPr>
+              <w:t>Problemi riscontrati e soluzioni adottate</w:t>
+            </w:r>
+          </w:p>
+        </w:tc>
+      </w:tr>
+      <w:tr>
+        <w:tc>
+          <w:tcPr>
+            <w:tcW w:w="9854" w:type="dxa"/>
+          </w:tcPr>
+          <w:p>
+            <w:pPr>
+              <w:rPr>
+                <w:rFonts w:ascii="Arial" w:hAnsi="Arial" w:cs="Arial"/>
+              </w:rPr>
+            </w:pPr>
+            <w:r>
+              <w:rPr>
+                <w:rFonts w:ascii="Arial" w:hAnsi="Arial" w:cs="Arial"/>
+              </w:rPr>
+              <w:t>Pistola con 30 colpi poco realistica: modalità definite in caricatori e aggiunta una seconda arma (REQ-011).</w:t>
+            </w:r>
+          </w:p>
+          <w:p>
+            <w:pPr>
+              <w:rPr>
+                <w:rFonts w:ascii="Arial" w:hAnsi="Arial" w:cs="Arial"/>
+              </w:rPr>
+            </w:pPr>
+            <w:r>
+              <w:rPr>
+                <w:rFonts w:ascii="Arial" w:hAnsi="Arial" w:cs="Arial"/>
+              </w:rPr>
+              <w:t>Versioni precedenti: REQ-002 1.1 (REQ-002_2: Munizioni limitate, 30 per caricatore); REQ-006 1.1 (REQ-006_1: Classica – 90 colpi (3 caricatori), ricarica permessa, conta il punteggio; REQ-006_2: A tempo – 60 secondi, munizioni illimitate con ricarica, conta il punteggio; REQ-006_3: Precisione – 30 colpi (1 caricatore), nessuna ricarica, conta la precisione); REQ-007 1.0 (REQ-007_2: Schermata end con punteggio, precisione e opzione di restart).</w:t>
+            </w:r>
+          </w:p>
+          <w:p>
+            <w:pPr>
+              <w:rPr>
+                <w:rFonts w:ascii="Arial" w:hAnsi="Arial" w:cs="Arial"/>
+              </w:rPr>
+            </w:pPr>
+            <w:r>
+              <w:rPr>
+                <w:rFonts w:ascii="Arial" w:hAnsi="Arial" w:cs="Arial"/>
+              </w:rPr>
+              <w:t>Nella creazione dello script Godot proponeva solo GDScript: risolto creando lo script C# Main.cs.</w:t>
+            </w:r>
+          </w:p>
+        </w:tc>
+      </w:tr>
+    </w:tbl>
+    <w:p>
+      <w:pPr>
+        <w:rPr>
+          <w:rFonts w:ascii="Arial" w:hAnsi="Arial" w:cs="Arial"/>
+        </w:rPr>
+      </w:pPr>
+    </w:p>
+    <w:tbl>
+      <w:tblPr>
+        <w:tblStyle w:val="Grigliatabella"/>
+        <w:tblW w:w="0" w:type="auto"/>
+        <w:tblLook w:val="04A0" w:firstRow="1" w:lastRow="0" w:firstColumn="1" w:lastColumn="0" w:noHBand="0" w:noVBand="1"/>
+      </w:tblPr>
+      <w:tblGrid>
+        <w:gridCol w:w="9628"/>
+      </w:tblGrid>
+      <w:tr>
+        <w:tc>
+          <w:tcPr>
+            <w:tcW w:w="9854" w:type="dxa"/>
+            <w:shd w:val="clear" w:color="auto" w:fill="D9D9D9" w:themeFill="background1" w:themeFillShade="D9"/>
+          </w:tcPr>
+          <w:p>
+            <w:pPr>
+              <w:rPr>
+                <w:rFonts w:ascii="Arial" w:hAnsi="Arial" w:cs="Arial"/>
+              </w:rPr>
+            </w:pPr>
+            <w:r>
+              <w:rPr>
+                <w:rFonts w:ascii="Arial" w:hAnsi="Arial" w:cs="Arial"/>
+              </w:rPr>
+              <w:t>Punto della situazione rispetto alla pianificazione</w:t>
+            </w:r>
+          </w:p>
+        </w:tc>
+      </w:tr>
+      <w:tr>
+        <w:tc>
+          <w:tcPr>
+            <w:tcW w:w="9854" w:type="dxa"/>
+          </w:tcPr>
+          <w:p>
+            <w:pPr>
+              <w:rPr>
+                <w:rFonts w:ascii="Arial" w:hAnsi="Arial" w:cs="Arial"/>
+              </w:rPr>
+            </w:pPr>
+            <w:r>
+              <w:rPr>
+                <w:rFonts w:ascii="Arial" w:hAnsi="Arial" w:cs="Arial"/>
+              </w:rPr>
+              <w:t>In linea con il Gantt: progettazione conclusa.</w:t>
+            </w:r>
+          </w:p>
+        </w:tc>
+      </w:tr>
+    </w:tbl>
+    <w:p>
+      <w:pPr>
+        <w:rPr>
+          <w:rFonts w:ascii="Arial" w:hAnsi="Arial" w:cs="Arial"/>
+        </w:rPr>
+      </w:pPr>
+    </w:p>
+    <w:tbl>
+      <w:tblPr>
+        <w:tblStyle w:val="Grigliatabella"/>
+        <w:tblW w:w="0" w:type="auto"/>
+        <w:tblLook w:val="04A0" w:firstRow="1" w:lastRow="0" w:firstColumn="1" w:lastColumn="0" w:noHBand="0" w:noVBand="1"/>
+      </w:tblPr>
+      <w:tblGrid>
+        <w:gridCol w:w="9628"/>
+      </w:tblGrid>
+      <w:tr>
+        <w:tc>
+          <w:tcPr>
+            <w:tcW w:w="9854" w:type="dxa"/>
+            <w:shd w:val="clear" w:color="auto" w:fill="D9D9D9" w:themeFill="background1" w:themeFillShade="D9"/>
+          </w:tcPr>
+          <w:p>
+            <w:pPr>
+              <w:rPr>
+                <w:rFonts w:ascii="Arial" w:hAnsi="Arial" w:cs="Arial"/>
+              </w:rPr>
+            </w:pPr>
+            <w:r>
+              <w:rPr>
+                <w:rFonts w:ascii="Arial" w:hAnsi="Arial" w:cs="Arial"/>
+              </w:rPr>
+              <w:t>Programma di massima per la prossima giornata di lavoro</w:t>
+            </w:r>
+          </w:p>
+        </w:tc>
+      </w:tr>
+      <w:tr>
+        <w:tc>
+          <w:tcPr>
+            <w:tcW w:w="9854" w:type="dxa"/>
+          </w:tcPr>
+          <w:p>
+            <w:pPr>
+              <w:rPr>
+                <w:rFonts w:ascii="Arial" w:hAnsi="Arial" w:cs="Arial"/>
+              </w:rPr>
+            </w:pPr>
+            <w:r>
+              <w:rPr>
+                <w:rFonts w:ascii="Arial" w:hAnsi="Arial" w:cs="Arial"/>
+              </w:rPr>
+              <w:t>Sviluppo: ambiente e interfaccia</w:t>
+            </w:r>
+            <w:proofErr w:type="spellStart"/>
+            <w:proofErr w:type="spellEnd"/>
+          </w:p>
+        </w:tc>
+      </w:tr>
+    </w:tbl>
+    <w:p>
+      <w:pPr>
+        <w:rPr>
+          <w:rFonts w:ascii="Arial" w:hAnsi="Arial" w:cs="Arial"/>
+        </w:rPr>
+      </w:pPr>
+    </w:p>
+    <w:p>
+      <w:pPr>
+        <w:rPr>
+          <w:rFonts w:ascii="Arial" w:hAnsi="Arial" w:cs="Arial"/>
+        </w:rPr>
+      </w:pPr>
+      <w:r>
+        <w:rPr>
+          <w:rFonts w:ascii="Arial" w:hAnsi="Arial" w:cs="Arial"/>
+        </w:rPr>
+        <w:br w:type="page"/>
+      </w:r>
+    </w:p>
+    <w:p>
+      <w:pPr>
+        <w:pStyle w:val="Titolo2"/>
+        <w:pBdr>
+          <w:bottom w:val="single" w:sz="4" w:space="1" w:color="auto"/>
+        </w:pBdr>
+      </w:pPr>
+      <w:r>
+        <w:lastRenderedPageBreak/>
+        <w:t>Utilizzo Intelligenza Artificiale nella giornata</w:t>
+      </w:r>
+    </w:p>
+    <w:p>
+      <w:pPr>
+        <w:pStyle w:val="Nessunaspaziatura"/>
+        <w:rPr>
+          <w:rFonts w:ascii="Arial" w:hAnsi="Arial" w:cs="Arial"/>
+        </w:rPr>
+      </w:pPr>
+      <w:r>
+        <w:br/>
+      </w:r>
+      <w:sdt>
+        <w:sdtPr>
+          <w:rPr>
+            <w:rFonts w:ascii="Segoe UI Symbol" w:hAnsi="Segoe UI Symbol" w:cs="Segoe UI Symbol"/>
+          </w:rPr>
+          <w:id w:val="226228411"/>
+          <w14:checkbox>
+            <w14:checked w14:val="1"/>
+            <w14:checkedState w14:val="2612" w14:font="MS Gothic"/>
+            <w14:uncheckedState w14:val="2610" w14:font="MS Gothic"/>
+          </w14:checkbox>
+        </w:sdtPr>
+        <w:sdtContent>
+          <w:r>
+            <w:rPr>
+              <w:rFonts w:ascii="MS Gothic" w:eastAsia="MS Gothic" w:hAnsi="MS Gothic" w:cs="Segoe UI Symbol" w:hint="eastAsia"/>
+            </w:rPr>
+            <w:t>☒</w:t>
+          </w:r>
+        </w:sdtContent>
+      </w:sdt>
+      <w:r>
+        <w:rPr>
+          <w:rFonts w:ascii="Arial" w:hAnsi="Arial" w:cs="Arial"/>
+        </w:rPr>
+        <w:t xml:space="preserve"> Frequente</w:t>
+      </w:r>
+    </w:p>
+    <w:p>
+      <w:pPr>
+        <w:pStyle w:val="Nessunaspaziatura"/>
+        <w:rPr>
+          <w:rFonts w:ascii="Arial" w:hAnsi="Arial" w:cs="Arial"/>
+        </w:rPr>
+      </w:pPr>
+    </w:p>
+    <w:p>
+      <w:pPr>
+        <w:pStyle w:val="Nessunaspaziatura"/>
+        <w:spacing w:line="276" w:lineRule="auto"/>
+        <w:rPr>
+          <w:rFonts w:ascii="Arial" w:hAnsi="Arial" w:cs="Arial"/>
+        </w:rPr>
+      </w:pPr>
+      <w:r>
+        <w:rPr>
+          <w:rFonts w:ascii="Arial" w:hAnsi="Arial" w:cs="Arial"/>
+          <w:b/>
+          <w:bCs/>
+        </w:rPr>
+        <w:t xml:space="preserve">Strumento/i utilizzato/i: </w:t>
+      </w:r>
+      <w:r>
+        <w:rPr>
+          <w:rFonts w:ascii="Arial" w:hAnsi="Arial" w:cs="Arial"/>
+        </w:rPr>
+        <w:t>Claude</w:t>
+      </w:r>
+    </w:p>
+    <w:p>
+      <w:pPr>
+        <w:pStyle w:val="Nessunaspaziatura"/>
+        <w:rPr>
+          <w:rFonts w:ascii="Arial" w:hAnsi="Arial" w:cs="Arial"/>
+        </w:rPr>
+      </w:pPr>
+    </w:p>
+    <w:p>
+      <w:pPr>
+        <w:pStyle w:val="Nessunaspaziatura"/>
+        <w:rPr>
+          <w:rFonts w:ascii="Arial" w:hAnsi="Arial" w:cs="Arial"/>
+        </w:rPr>
+      </w:pPr>
+      <w:r>
+        <w:rPr>
+          <w:rFonts w:ascii="Arial" w:hAnsi="Arial" w:cs="Arial"/>
+          <w:b/>
+          <w:bCs/>
+        </w:rPr>
+        <w:t>Per cosa l’ho usata oggi</w:t>
+      </w:r>
+      <w:r>
+        <w:br/>
+      </w:r>
+      <w:sdt>
+        <w:sdtPr>
+          <w:rPr>
+            <w:rFonts w:ascii="Segoe UI Symbol" w:hAnsi="Segoe UI Symbol" w:cs="Segoe UI Symbol"/>
+          </w:rPr>
+          <w:id w:val="639302609"/>
+          <w14:checkbox>
+            <w14:checked w14:val="1"/>
+            <w14:checkedState w14:val="2612" w14:font="MS Gothic"/>
+            <w14:uncheckedState w14:val="2610" w14:font="MS Gothic"/>
+          </w14:checkbox>
+        </w:sdtPr>
+        <w:sdtContent>
+          <w:r>
+            <w:rPr>
+              <w:rFonts w:ascii="MS Gothic" w:eastAsia="MS Gothic" w:hAnsi="MS Gothic" w:cs="Segoe UI Symbol" w:hint="eastAsia"/>
+            </w:rPr>
+            <w:t>☒</w:t>
+          </w:r>
+        </w:sdtContent>
+      </w:sdt>
+      <w:r>
+        <w:rPr>
+          <w:rFonts w:ascii="Arial" w:hAnsi="Arial" w:cs="Arial"/>
+        </w:rPr>
+        <w:t xml:space="preserve"> Riorganizzare idee / testi</w:t>
+      </w:r>
+    </w:p>
+    <w:p>
+      <w:pPr>
+        <w:pStyle w:val="Nessunaspaziatura"/>
+        <w:rPr>
+          <w:rFonts w:ascii="Arial" w:hAnsi="Arial" w:cs="Arial"/>
+        </w:rPr>
+      </w:pPr>
+    </w:p>
+    <w:p>
+      <w:pPr>
+        <w:pStyle w:val="Nessunaspaziatura"/>
+        <w:rPr>
+          <w:rFonts w:ascii="Arial" w:hAnsi="Arial" w:cs="Arial"/>
+          <w:b/>
+          <w:bCs/>
+        </w:rPr>
+      </w:pPr>
+      <w:r>
+        <w:rPr>
+          <w:rFonts w:ascii="Arial" w:hAnsi="Arial" w:cs="Arial"/>
+          <w:b/>
+          <w:bCs/>
+        </w:rPr>
+        <w:t>Esempio significativo di utilizzo (UNO SOLO)</w:t>
+      </w:r>
+    </w:p>
+    <w:p>
+      <w:pPr>
+        <w:pStyle w:val="Nessunaspaziatura"/>
+        <w:rPr>
+          <w:rFonts w:ascii="Arial" w:hAnsi="Arial" w:cs="Arial"/>
+        </w:rPr>
+      </w:pPr>
+      <w:r>
+        <w:rPr>
+          <w:rFonts w:ascii="Arial" w:hAnsi="Arial" w:cs="Arial"/>
+        </w:rPr>
+        <w:t>Creazione dei mockup e guida per il prototipo in Godot</w:t>
+      </w:r>
+    </w:p>
+    <w:p>
+      <w:pPr>
+        <w:pStyle w:val="Nessunaspaziatura"/>
+        <w:rPr>
+          <w:rFonts w:ascii="Arial" w:hAnsi="Arial" w:cs="Arial"/>
+        </w:rPr>
+      </w:pPr>
+    </w:p>
+    <w:p>
+      <w:pPr>
+        <w:pStyle w:val="Nessunaspaziatura"/>
+        <w:rPr>
+          <w:rFonts w:ascii="Arial" w:hAnsi="Arial" w:cs="Arial"/>
+        </w:rPr>
+      </w:pPr>
+      <w:r>
+        <w:rPr>
+          <w:rFonts w:ascii="Arial" w:hAnsi="Arial" w:cs="Arial"/>
+          <w:b/>
+          <w:bCs/>
+        </w:rPr>
+        <w:t>Cosa mi ha dato l’AI</w:t>
+      </w:r>
+    </w:p>
+    <w:p>
+      <w:pPr>
+        <w:pStyle w:val="Nessunaspaziatura"/>
+        <w:rPr>
+          <w:rFonts w:ascii="Arial" w:hAnsi="Arial" w:cs="Arial"/>
+        </w:rPr>
+      </w:pPr>
+      <w:r>
+        <w:rPr>
+          <w:rFonts w:ascii="Arial" w:hAnsi="Arial" w:cs="Arial"/>
+        </w:rPr>
+        <w:t>Mockup e aggiornamento dei testi</w:t>
+      </w:r>
+    </w:p>
+    <w:p>
+      <w:pPr>
+        <w:pStyle w:val="Nessunaspaziatura"/>
+        <w:rPr>
+          <w:rFonts w:ascii="Arial" w:hAnsi="Arial" w:cs="Arial"/>
+          <w:b/>
+          <w:bCs/>
+        </w:rPr>
+      </w:pPr>
+    </w:p>
+    <w:p>
+      <w:pPr>
+        <w:pStyle w:val="Nessunaspaziatura"/>
+        <w:rPr>
+          <w:rFonts w:ascii="Arial" w:hAnsi="Arial" w:cs="Arial"/>
+        </w:rPr>
+      </w:pPr>
+      <w:r>
+        <w:rPr>
+          <w:rFonts w:ascii="Arial" w:hAnsi="Arial" w:cs="Arial"/>
+          <w:b/>
+          <w:bCs/>
+        </w:rPr>
+        <w:t>Come l’ho usato io</w:t>
+      </w:r>
+      <w:r>
+        <w:rPr>
+          <w:rFonts w:ascii="Arial" w:hAnsi="Arial" w:cs="Arial"/>
+        </w:rPr>
+        <w:br/>
+      </w:r>
+      <w:sdt>
+        <w:sdtPr>
+          <w:rPr>
+            <w:rFonts w:ascii="Segoe UI Symbol" w:hAnsi="Segoe UI Symbol" w:cs="Segoe UI Symbol"/>
+          </w:rPr>
+          <w:id w:val="1852742088"/>
+          <w14:checkbox>
+            <w14:checked w14:val="1"/>
+            <w14:checkedState w14:val="2612" w14:font="MS Gothic"/>
+            <w14:uncheckedState w14:val="2610" w14:font="MS Gothic"/>
+          </w14:checkbox>
+        </w:sdtPr>
+        <w:sdtContent>
+          <w:r>
+            <w:rPr>
+              <w:rFonts w:ascii="MS Gothic" w:eastAsia="MS Gothic" w:hAnsi="MS Gothic" w:cs="Segoe UI Symbol" w:hint="eastAsia"/>
+            </w:rPr>
+            <w:t>☒</w:t>
+          </w:r>
+        </w:sdtContent>
+      </w:sdt>
+      <w:r>
+        <w:rPr>
+          <w:rFonts w:ascii="Arial" w:hAnsi="Arial" w:cs="Arial"/>
+        </w:rPr>
+        <w:t xml:space="preserve"> Adattato</w:t>
+      </w:r>
+    </w:p>
+    <w:p>
+      <w:pPr>
+        <w:pStyle w:val="Nessunaspaziatura"/>
+        <w:rPr>
+          <w:rFonts w:ascii="Arial" w:hAnsi="Arial" w:cs="Arial"/>
+        </w:rPr>
+      </w:pPr>
+    </w:p>
+    <w:p>
+      <w:pPr>
+        <w:pStyle w:val="Nessunaspaziatura"/>
+        <w:rPr>
+          <w:rFonts w:ascii="Arial" w:hAnsi="Arial" w:cs="Arial"/>
+        </w:rPr>
+      </w:pPr>
+      <w:r>
+        <w:rPr>
+          <w:rFonts w:ascii="Arial" w:hAnsi="Arial" w:cs="Arial"/>
+          <w:b/>
+          <w:bCs/>
+        </w:rPr>
+        <w:t>Cosa avrei fatto senza AI?</w:t>
+      </w:r>
+    </w:p>
+    <w:p>
+      <w:pPr>
+        <w:pStyle w:val="Nessunaspaziatura"/>
+        <w:spacing w:line="276" w:lineRule="auto"/>
+        <w:rPr>
+          <w:rFonts w:ascii="Arial" w:hAnsi="Arial" w:cs="Arial"/>
+        </w:rPr>
+      </w:pPr>
+      <w:r>
+        <w:rPr>
+          <w:rFonts w:ascii="Arial" w:hAnsi="Arial" w:cs="Arial"/>
+        </w:rPr>
+        <w:t>Più tempo per i mockup</w:t>
       </w:r>
     </w:p>
     <w:sectPr>

</xml_diff>